<commit_message>
Last update on things
</commit_message>
<xml_diff>
--- a/Files/GrowNear_Proposta_Valor.docx
+++ b/Files/GrowNear_Proposta_Valor.docx
@@ -34,6 +34,7 @@
     </w:p>
     <w:p>
       <w:pPr>
+        <w:spacing w:after="200"/>
         <w:rPr>
           <w:rFonts w:ascii="Noto Sans" w:hAnsi="Noto Sans" w:cs="Noto Sans"/>
           <w:lang w:val="pt-PT"/>
@@ -42,127 +43,143 @@
       <w:r>
         <w:rPr>
           <w:rFonts w:ascii="Noto Sans" w:hAnsi="Noto Sans" w:cs="Noto Sans"/>
+          <w:b/>
+          <w:bCs/>
           <w:lang w:val="pt-PT"/>
         </w:rPr>
-        <w:t>For: Pequenos Produtores, compradores locais</w:t>
+        <w:t xml:space="preserve">Para </w:t>
       </w:r>
       <w:r>
         <w:rPr>
           <w:rFonts w:ascii="Noto Sans" w:hAnsi="Noto Sans" w:cs="Noto Sans"/>
           <w:lang w:val="pt-PT"/>
         </w:rPr>
-        <w:t>.</w:t>
+        <w:t xml:space="preserve">pequenos produtores não profissionais com excedentes da horta, do pomar, do galinheiro ou das colmeias, e compradores da zona que procuram produtos locais frescos,</w:t>
       </w:r>
     </w:p>
     <w:p>
       <w:pPr>
+        <w:spacing w:after="200"/>
         <w:rPr>
           <w:rFonts w:ascii="Noto Sans" w:hAnsi="Noto Sans" w:cs="Noto Sans"/>
           <w:lang w:val="pt-PT"/>
         </w:rPr>
       </w:pPr>
-      <w:proofErr w:type="spellStart"/>
       <w:r>
         <w:rPr>
           <w:rFonts w:ascii="Noto Sans" w:hAnsi="Noto Sans" w:cs="Noto Sans"/>
+          <w:b/>
+          <w:bCs/>
           <w:lang w:val="pt-PT"/>
         </w:rPr>
-        <w:t>Who</w:t>
-      </w:r>
-      <w:proofErr w:type="spellEnd"/>
-      <w:r>
-        <w:rPr>
-          <w:rFonts w:ascii="Noto Sans" w:hAnsi="Noto Sans" w:cs="Noto Sans"/>
-          <w:lang w:val="pt-PT"/>
-        </w:rPr>
-        <w:t>: Para produtores locais com dificuldade em escoar produto &amp; para compradores locais interessados e produtos biológicos</w:t>
+        <w:t xml:space="preserve">Que </w:t>
       </w:r>
       <w:r>
         <w:rPr>
           <w:rFonts w:ascii="Noto Sans" w:hAnsi="Noto Sans" w:cs="Noto Sans"/>
           <w:lang w:val="pt-PT"/>
         </w:rPr>
-        <w:t>.</w:t>
+        <w:t xml:space="preserve">têm dificuldade em escoar pequenas quantidades sem burocracia nem intermediários (produtores), ou querem produtos frescos e naturais, de origem conhecida, perto de casa (compradores),</w:t>
       </w:r>
     </w:p>
     <w:p>
       <w:pPr>
+        <w:spacing w:after="200"/>
         <w:rPr>
           <w:rFonts w:ascii="Noto Sans" w:hAnsi="Noto Sans" w:cs="Noto Sans"/>
+          <w:lang w:val="pt-PT"/>
         </w:rPr>
       </w:pPr>
       <w:r>
         <w:rPr>
           <w:rFonts w:ascii="Noto Sans" w:hAnsi="Noto Sans" w:cs="Noto Sans"/>
+          <w:b/>
+          <w:bCs/>
+          <w:lang w:val="pt-PT"/>
         </w:rPr>
-        <w:t xml:space="preserve">The: The </w:t>
-      </w:r>
-      <w:proofErr w:type="spellStart"/>
-      <w:r>
-        <w:rPr>
-          <w:rFonts w:ascii="Noto Sans" w:hAnsi="Noto Sans" w:cs="Noto Sans"/>
-        </w:rPr>
-        <w:t>GrowNear</w:t>
-      </w:r>
-      <w:proofErr w:type="spellEnd"/>
-      <w:r>
-        <w:rPr>
-          <w:rFonts w:ascii="Noto Sans" w:hAnsi="Noto Sans" w:cs="Noto Sans"/>
-        </w:rPr>
-        <w:t xml:space="preserve"> is a marketplace app. </w:t>
-      </w:r>
-    </w:p>
-    <w:p>
-      <w:pPr>
-        <w:rPr>
-          <w:rFonts w:ascii="Noto Sans" w:hAnsi="Noto Sans" w:cs="Noto Sans"/>
-        </w:rPr>
-      </w:pPr>
-      <w:r>
-        <w:rPr>
-          <w:rFonts w:ascii="Noto Sans" w:hAnsi="Noto Sans" w:cs="Noto Sans"/>
-        </w:rPr>
-        <w:t>That:  Connects producers and buyers of local goods. Unlike: Farmers markets, generic shops</w:t>
+        <w:t xml:space="preserve">A </w:t>
       </w:r>
       <w:r>
         <w:rPr>
           <w:rFonts w:ascii="Noto Sans" w:hAnsi="Noto Sans" w:cs="Noto Sans"/>
+          <w:lang w:val="pt-PT"/>
         </w:rPr>
-        <w:t>.</w:t>
+        <w:t xml:space="preserve">GrowNear é uma app marketplace local, com descoberta por mapa,</w:t>
       </w:r>
     </w:p>
     <w:p>
       <w:pPr>
+        <w:spacing w:after="200"/>
         <w:rPr>
-          <w:sz w:val="28"/>
-          <w:szCs w:val="28"/>
+          <w:rFonts w:ascii="Noto Sans" w:hAnsi="Noto Sans" w:cs="Noto Sans"/>
+          <w:lang w:val="pt-PT"/>
         </w:rPr>
       </w:pPr>
       <w:r>
         <w:rPr>
           <w:rFonts w:ascii="Noto Sans" w:hAnsi="Noto Sans" w:cs="Noto Sans"/>
+          <w:b/>
+          <w:bCs/>
+          <w:lang w:val="pt-PT"/>
         </w:rPr>
-        <w:t xml:space="preserve">Our Solution: </w:t>
-      </w:r>
-      <w:proofErr w:type="spellStart"/>
-      <w:r>
-        <w:rPr>
-          <w:rFonts w:ascii="Noto Sans" w:hAnsi="Noto Sans" w:cs="Noto Sans"/>
-        </w:rPr>
-        <w:t>GrowNear</w:t>
-      </w:r>
-      <w:proofErr w:type="spellEnd"/>
-      <w:r>
-        <w:rPr>
-          <w:rFonts w:ascii="Noto Sans" w:hAnsi="Noto Sans" w:cs="Noto Sans"/>
-        </w:rPr>
-        <w:t xml:space="preserve"> focuses on the surplus of non-professional producers, with no bureaucracy or intermediaries, map-based discovery, "notify me" alerts and optional in-app payment, so buyers pay less than at organic shops and know exactly where their food comes from</w:t>
+        <w:t xml:space="preserve">Que </w:t>
       </w:r>
       <w:r>
         <w:rPr>
           <w:rFonts w:ascii="Noto Sans" w:hAnsi="Noto Sans" w:cs="Noto Sans"/>
+          <w:lang w:val="pt-PT"/>
         </w:rPr>
-        <w:t>.</w:t>
+        <w:t xml:space="preserve">liga vizinhos: o comprador encontra o que há perto, reserva e paga na app, e recolhe em casa do produtor ou num ponto de recolha.</w:t>
+      </w:r>
+    </w:p>
+    <w:p>
+      <w:pPr>
+        <w:spacing w:after="200"/>
+        <w:rPr>
+          <w:rFonts w:ascii="Noto Sans" w:hAnsi="Noto Sans" w:cs="Noto Sans"/>
+          <w:lang w:val="pt-PT"/>
+        </w:rPr>
+      </w:pPr>
+      <w:r>
+        <w:rPr>
+          <w:rFonts w:ascii="Noto Sans" w:hAnsi="Noto Sans" w:cs="Noto Sans"/>
+          <w:b/>
+          <w:bCs/>
+          <w:lang w:val="pt-PT"/>
+        </w:rPr>
+        <w:t xml:space="preserve">Ao contrário de </w:t>
+      </w:r>
+      <w:r>
+        <w:rPr>
+          <w:rFonts w:ascii="Noto Sans" w:hAnsi="Noto Sans" w:cs="Noto Sans"/>
+          <w:lang w:val="pt-PT"/>
+        </w:rPr>
+        <w:t xml:space="preserve">feiras e mercados, lojas de produtos biológicos e anúncios online genéricos,</w:t>
+      </w:r>
+    </w:p>
+    <w:p>
+      <w:pPr>
+        <w:spacing w:after="200"/>
+        <w:rPr>
+          <w:rFonts w:ascii="Noto Sans" w:hAnsi="Noto Sans" w:cs="Noto Sans"/>
+          <w:lang w:val="pt-PT"/>
+        </w:rPr>
+      </w:pPr>
+      <w:r>
+        <w:rPr>
+          <w:rFonts w:ascii="Noto Sans" w:hAnsi="Noto Sans" w:cs="Noto Sans"/>
+          <w:b/>
+          <w:bCs/>
+          <w:lang w:val="pt-PT"/>
+        </w:rPr>
+        <w:t xml:space="preserve">A nossa solução: </w:t>
+      </w:r>
+      <w:r>
+        <w:rPr>
+          <w:rFonts w:ascii="Noto Sans" w:hAnsi="Noto Sans" w:cs="Noto Sans"/>
+          <w:lang w:val="pt-PT"/>
+        </w:rPr>
+        <w:t xml:space="preserve">a GrowNear foca-se nos excedentes de produtores não profissionais, sem burocracia nem intermediários, com descoberta por mapa, alertas "avisem-me" e pagamento opcional na app, para que o comprador pague menos do que numa loja de produtos biológicos e saiba exatamente de onde vem o que come.</w:t>
       </w:r>
     </w:p>
     <w:p/>

</xml_diff>